<commit_message>
Add MQTT smart socket lab
</commit_message>
<xml_diff>
--- a/output/mobile-app-practice/02-handler/实验2_Handler的使用_实验报告.docx
+++ b/output/mobile-app-practice/02-handler/实验2_Handler的使用_实验报告.docx
@@ -117,14 +117,6 @@
         <w:gridCol w:w="564"/>
       </w:tblGrid>
       <w:tr>
-        <w:tblPrEx>
-          <w:tblCellMar>
-            <w:top w:w="0" w:type="dxa"/>
-            <w:left w:w="108" w:type="dxa"/>
-            <w:bottom w:w="0" w:type="dxa"/>
-            <w:right w:w="108" w:type="dxa"/>
-          </w:tblCellMar>
-        </w:tblPrEx>
         <w:tc>
           <w:tcPr>
             <w:tcW w:w="5062" w:type="dxa"/>
@@ -173,14 +165,6 @@
         </w:tc>
       </w:tr>
       <w:tr>
-        <w:tblPrEx>
-          <w:tblCellMar>
-            <w:top w:w="0" w:type="dxa"/>
-            <w:left w:w="108" w:type="dxa"/>
-            <w:bottom w:w="0" w:type="dxa"/>
-            <w:right w:w="108" w:type="dxa"/>
-          </w:tblCellMar>
-        </w:tblPrEx>
         <w:tc>
           <w:tcPr>
             <w:tcW w:w="5062" w:type="dxa"/>
@@ -219,14 +203,6 @@
         </w:tc>
       </w:tr>
       <w:tr>
-        <w:tblPrEx>
-          <w:tblCellMar>
-            <w:top w:w="0" w:type="dxa"/>
-            <w:left w:w="108" w:type="dxa"/>
-            <w:bottom w:w="0" w:type="dxa"/>
-            <w:right w:w="108" w:type="dxa"/>
-          </w:tblCellMar>
-        </w:tblPrEx>
         <w:tc>
           <w:tcPr>
             <w:tcW w:w="5062" w:type="dxa"/>
@@ -285,14 +261,6 @@
         </w:tc>
       </w:tr>
       <w:tr>
-        <w:tblPrEx>
-          <w:tblCellMar>
-            <w:top w:w="0" w:type="dxa"/>
-            <w:left w:w="108" w:type="dxa"/>
-            <w:bottom w:w="0" w:type="dxa"/>
-            <w:right w:w="108" w:type="dxa"/>
-          </w:tblCellMar>
-        </w:tblPrEx>
         <w:tc>
           <w:tcPr>
             <w:tcW w:w="5062" w:type="dxa"/>
@@ -351,14 +319,6 @@
         </w:tc>
       </w:tr>
       <w:tr>
-        <w:tblPrEx>
-          <w:tblCellMar>
-            <w:top w:w="0" w:type="dxa"/>
-            <w:left w:w="108" w:type="dxa"/>
-            <w:bottom w:w="0" w:type="dxa"/>
-            <w:right w:w="108" w:type="dxa"/>
-          </w:tblCellMar>
-        </w:tblPrEx>
         <w:tc>
           <w:tcPr>
             <w:tcW w:w="5062" w:type="dxa"/>
@@ -369,11 +329,12 @@
               <w:spacing w:line="240" w:lineRule="auto"/>
               <w:jc w:val="both"/>
               <w:rPr>
-                <w:rFonts w:ascii="宋体" w:hAnsi="宋体"/>
+                <w:rFonts w:hint="default" w:ascii="宋体" w:hAnsi="宋体" w:eastAsia="宋体"/>
                 <w:b/>
                 <w:bCs/>
                 <w:sz w:val="32"/>
                 <w:szCs w:val="32"/>
+                <w:lang w:val="en-US" w:eastAsia="zh-CN"/>
               </w:rPr>
             </w:pPr>
             <w:r>
@@ -385,6 +346,17 @@
                 <w:szCs w:val="32"/>
               </w:rPr>
               <w:t>学    号：</w:t>
+            </w:r>
+            <w:r>
+              <w:rPr>
+                <w:rFonts w:hint="eastAsia" w:ascii="宋体" w:hAnsi="宋体"/>
+                <w:b/>
+                <w:bCs/>
+                <w:sz w:val="32"/>
+                <w:szCs w:val="32"/>
+                <w:lang w:val="en-US" w:eastAsia="zh-CN"/>
+              </w:rPr>
+              <w:t>2315302125</w:t>
             </w:r>
           </w:p>
         </w:tc>
@@ -397,14 +369,6 @@
         </w:tc>
       </w:tr>
       <w:tr>
-        <w:tblPrEx>
-          <w:tblCellMar>
-            <w:top w:w="0" w:type="dxa"/>
-            <w:left w:w="108" w:type="dxa"/>
-            <w:bottom w:w="0" w:type="dxa"/>
-            <w:right w:w="108" w:type="dxa"/>
-          </w:tblCellMar>
-        </w:tblPrEx>
         <w:tc>
           <w:tcPr>
             <w:tcW w:w="5062" w:type="dxa"/>
@@ -415,11 +379,12 @@
               <w:spacing w:line="240" w:lineRule="auto"/>
               <w:jc w:val="both"/>
               <w:rPr>
-                <w:rFonts w:ascii="宋体" w:hAnsi="宋体"/>
+                <w:rFonts w:hint="eastAsia" w:ascii="宋体" w:hAnsi="宋体" w:eastAsia="宋体"/>
                 <w:b/>
                 <w:bCs/>
                 <w:sz w:val="32"/>
                 <w:szCs w:val="32"/>
+                <w:lang w:val="en-US" w:eastAsia="zh-CN"/>
               </w:rPr>
             </w:pPr>
             <w:r>
@@ -432,6 +397,19 @@
               </w:rPr>
               <w:t>姓    名：</w:t>
             </w:r>
+            <w:r>
+              <w:rPr>
+                <w:rFonts w:hint="eastAsia" w:ascii="宋体" w:hAnsi="宋体"/>
+                <w:b/>
+                <w:bCs/>
+                <w:sz w:val="32"/>
+                <w:szCs w:val="32"/>
+                <w:lang w:val="en-US" w:eastAsia="zh-CN"/>
+              </w:rPr>
+              <w:t>崔子霖</w:t>
+            </w:r>
+            <w:bookmarkStart w:id="11" w:name="_GoBack"/>
+            <w:bookmarkEnd w:id="11"/>
           </w:p>
         </w:tc>
         <w:tc>
@@ -443,14 +421,6 @@
         </w:tc>
       </w:tr>
       <w:tr>
-        <w:tblPrEx>
-          <w:tblCellMar>
-            <w:top w:w="0" w:type="dxa"/>
-            <w:left w:w="108" w:type="dxa"/>
-            <w:bottom w:w="0" w:type="dxa"/>
-            <w:right w:w="108" w:type="dxa"/>
-          </w:tblCellMar>
-        </w:tblPrEx>
         <w:tc>
           <w:tcPr>
             <w:tcW w:w="5062" w:type="dxa"/>
@@ -1771,22 +1741,6 @@
         <w:gridCol w:w="4307"/>
       </w:tblGrid>
       <w:tr>
-        <w:tblPrEx>
-          <w:tblBorders>
-            <w:top w:val="single" w:color="auto" w:sz="4" w:space="0"/>
-            <w:left w:val="single" w:color="auto" w:sz="4" w:space="0"/>
-            <w:bottom w:val="single" w:color="auto" w:sz="4" w:space="0"/>
-            <w:right w:val="single" w:color="auto" w:sz="4" w:space="0"/>
-            <w:insideH w:val="single" w:color="auto" w:sz="4" w:space="0"/>
-            <w:insideV w:val="single" w:color="auto" w:sz="4" w:space="0"/>
-          </w:tblBorders>
-          <w:tblCellMar>
-            <w:top w:w="0" w:type="dxa"/>
-            <w:left w:w="108" w:type="dxa"/>
-            <w:bottom w:w="0" w:type="dxa"/>
-            <w:right w:w="108" w:type="dxa"/>
-          </w:tblCellMar>
-        </w:tblPrEx>
         <w:trPr>
           <w:jc w:val="center"/>
         </w:trPr>
@@ -1857,22 +1811,6 @@
         </w:tc>
       </w:tr>
       <w:tr>
-        <w:tblPrEx>
-          <w:tblBorders>
-            <w:top w:val="single" w:color="auto" w:sz="4" w:space="0"/>
-            <w:left w:val="single" w:color="auto" w:sz="4" w:space="0"/>
-            <w:bottom w:val="single" w:color="auto" w:sz="4" w:space="0"/>
-            <w:right w:val="single" w:color="auto" w:sz="4" w:space="0"/>
-            <w:insideH w:val="single" w:color="auto" w:sz="4" w:space="0"/>
-            <w:insideV w:val="single" w:color="auto" w:sz="4" w:space="0"/>
-          </w:tblBorders>
-          <w:tblCellMar>
-            <w:top w:w="0" w:type="dxa"/>
-            <w:left w:w="108" w:type="dxa"/>
-            <w:bottom w:w="0" w:type="dxa"/>
-            <w:right w:w="108" w:type="dxa"/>
-          </w:tblCellMar>
-        </w:tblPrEx>
         <w:trPr>
           <w:jc w:val="center"/>
         </w:trPr>
@@ -1938,22 +1876,6 @@
         </w:tc>
       </w:tr>
       <w:tr>
-        <w:tblPrEx>
-          <w:tblBorders>
-            <w:top w:val="single" w:color="auto" w:sz="4" w:space="0"/>
-            <w:left w:val="single" w:color="auto" w:sz="4" w:space="0"/>
-            <w:bottom w:val="single" w:color="auto" w:sz="4" w:space="0"/>
-            <w:right w:val="single" w:color="auto" w:sz="4" w:space="0"/>
-            <w:insideH w:val="single" w:color="auto" w:sz="4" w:space="0"/>
-            <w:insideV w:val="single" w:color="auto" w:sz="4" w:space="0"/>
-          </w:tblBorders>
-          <w:tblCellMar>
-            <w:top w:w="0" w:type="dxa"/>
-            <w:left w:w="108" w:type="dxa"/>
-            <w:bottom w:w="0" w:type="dxa"/>
-            <w:right w:w="108" w:type="dxa"/>
-          </w:tblCellMar>
-        </w:tblPrEx>
         <w:trPr>
           <w:jc w:val="center"/>
         </w:trPr>
@@ -2010,22 +1932,6 @@
         </w:tc>
       </w:tr>
       <w:tr>
-        <w:tblPrEx>
-          <w:tblBorders>
-            <w:top w:val="single" w:color="auto" w:sz="4" w:space="0"/>
-            <w:left w:val="single" w:color="auto" w:sz="4" w:space="0"/>
-            <w:bottom w:val="single" w:color="auto" w:sz="4" w:space="0"/>
-            <w:right w:val="single" w:color="auto" w:sz="4" w:space="0"/>
-            <w:insideH w:val="single" w:color="auto" w:sz="4" w:space="0"/>
-            <w:insideV w:val="single" w:color="auto" w:sz="4" w:space="0"/>
-          </w:tblBorders>
-          <w:tblCellMar>
-            <w:top w:w="0" w:type="dxa"/>
-            <w:left w:w="108" w:type="dxa"/>
-            <w:bottom w:w="0" w:type="dxa"/>
-            <w:right w:w="108" w:type="dxa"/>
-          </w:tblCellMar>
-        </w:tblPrEx>
         <w:trPr>
           <w:trHeight w:val="50" w:hRule="atLeast"/>
           <w:jc w:val="center"/>
@@ -2089,22 +1995,6 @@
         </w:tc>
       </w:tr>
       <w:tr>
-        <w:tblPrEx>
-          <w:tblBorders>
-            <w:top w:val="single" w:color="auto" w:sz="4" w:space="0"/>
-            <w:left w:val="single" w:color="auto" w:sz="4" w:space="0"/>
-            <w:bottom w:val="single" w:color="auto" w:sz="4" w:space="0"/>
-            <w:right w:val="single" w:color="auto" w:sz="4" w:space="0"/>
-            <w:insideH w:val="single" w:color="auto" w:sz="4" w:space="0"/>
-            <w:insideV w:val="single" w:color="auto" w:sz="4" w:space="0"/>
-          </w:tblBorders>
-          <w:tblCellMar>
-            <w:top w:w="0" w:type="dxa"/>
-            <w:left w:w="108" w:type="dxa"/>
-            <w:bottom w:w="0" w:type="dxa"/>
-            <w:right w:w="108" w:type="dxa"/>
-          </w:tblCellMar>
-        </w:tblPrEx>
         <w:trPr>
           <w:jc w:val="center"/>
         </w:trPr>
@@ -2164,22 +2054,6 @@
         </w:tc>
       </w:tr>
       <w:tr>
-        <w:tblPrEx>
-          <w:tblBorders>
-            <w:top w:val="single" w:color="auto" w:sz="4" w:space="0"/>
-            <w:left w:val="single" w:color="auto" w:sz="4" w:space="0"/>
-            <w:bottom w:val="single" w:color="auto" w:sz="4" w:space="0"/>
-            <w:right w:val="single" w:color="auto" w:sz="4" w:space="0"/>
-            <w:insideH w:val="single" w:color="auto" w:sz="4" w:space="0"/>
-            <w:insideV w:val="single" w:color="auto" w:sz="4" w:space="0"/>
-          </w:tblBorders>
-          <w:tblCellMar>
-            <w:top w:w="0" w:type="dxa"/>
-            <w:left w:w="108" w:type="dxa"/>
-            <w:bottom w:w="0" w:type="dxa"/>
-            <w:right w:w="108" w:type="dxa"/>
-          </w:tblCellMar>
-        </w:tblPrEx>
         <w:trPr>
           <w:jc w:val="center"/>
         </w:trPr>
@@ -2218,22 +2092,6 @@
         </w:tc>
       </w:tr>
       <w:tr>
-        <w:tblPrEx>
-          <w:tblBorders>
-            <w:top w:val="single" w:color="auto" w:sz="4" w:space="0"/>
-            <w:left w:val="single" w:color="auto" w:sz="4" w:space="0"/>
-            <w:bottom w:val="single" w:color="auto" w:sz="4" w:space="0"/>
-            <w:right w:val="single" w:color="auto" w:sz="4" w:space="0"/>
-            <w:insideH w:val="single" w:color="auto" w:sz="4" w:space="0"/>
-            <w:insideV w:val="single" w:color="auto" w:sz="4" w:space="0"/>
-          </w:tblBorders>
-          <w:tblCellMar>
-            <w:top w:w="0" w:type="dxa"/>
-            <w:left w:w="108" w:type="dxa"/>
-            <w:bottom w:w="0" w:type="dxa"/>
-            <w:right w:w="108" w:type="dxa"/>
-          </w:tblCellMar>
-        </w:tblPrEx>
         <w:trPr>
           <w:jc w:val="center"/>
         </w:trPr>
@@ -2284,22 +2142,6 @@
         </w:tc>
       </w:tr>
       <w:tr>
-        <w:tblPrEx>
-          <w:tblBorders>
-            <w:top w:val="single" w:color="auto" w:sz="4" w:space="0"/>
-            <w:left w:val="single" w:color="auto" w:sz="4" w:space="0"/>
-            <w:bottom w:val="single" w:color="auto" w:sz="4" w:space="0"/>
-            <w:right w:val="single" w:color="auto" w:sz="4" w:space="0"/>
-            <w:insideH w:val="single" w:color="auto" w:sz="4" w:space="0"/>
-            <w:insideV w:val="single" w:color="auto" w:sz="4" w:space="0"/>
-          </w:tblBorders>
-          <w:tblCellMar>
-            <w:top w:w="0" w:type="dxa"/>
-            <w:left w:w="108" w:type="dxa"/>
-            <w:bottom w:w="0" w:type="dxa"/>
-            <w:right w:w="108" w:type="dxa"/>
-          </w:tblCellMar>
-        </w:tblPrEx>
         <w:trPr>
           <w:jc w:val="center"/>
         </w:trPr>
@@ -2338,22 +2180,6 @@
         </w:tc>
       </w:tr>
       <w:tr>
-        <w:tblPrEx>
-          <w:tblBorders>
-            <w:top w:val="single" w:color="auto" w:sz="4" w:space="0"/>
-            <w:left w:val="single" w:color="auto" w:sz="4" w:space="0"/>
-            <w:bottom w:val="single" w:color="auto" w:sz="4" w:space="0"/>
-            <w:right w:val="single" w:color="auto" w:sz="4" w:space="0"/>
-            <w:insideH w:val="single" w:color="auto" w:sz="4" w:space="0"/>
-            <w:insideV w:val="single" w:color="auto" w:sz="4" w:space="0"/>
-          </w:tblBorders>
-          <w:tblCellMar>
-            <w:top w:w="0" w:type="dxa"/>
-            <w:left w:w="108" w:type="dxa"/>
-            <w:bottom w:w="0" w:type="dxa"/>
-            <w:right w:w="108" w:type="dxa"/>
-          </w:tblCellMar>
-        </w:tblPrEx>
         <w:trPr>
           <w:jc w:val="center"/>
         </w:trPr>
@@ -3589,7 +3415,7 @@
       </w:pPr>
       <w:r>
         <w:pict>
-          <v:shape id="_x0000_s2050" o:spid="_x0000_s2050" o:spt="75" type="#_x0000_t75" style="position:absolute;left:0pt;margin-left:301.1pt;margin-top:8.55pt;height:260.2pt;width:165.55pt;mso-wrap-distance-bottom:0pt;mso-wrap-distance-left:9pt;mso-wrap-distance-right:9pt;mso-wrap-distance-top:0pt;z-index:251661312;mso-width-relative:page;mso-height-relative:page;" o:ole="t" filled="f" o:preferrelative="t" stroked="f" coordsize="21600,21600">
+          <v:shape id="_x0000_s2050" o:spid="_x0000_s2050" o:spt="75" type="#_x0000_t75" style="position:absolute;left:0pt;margin-left:301.1pt;margin-top:8.55pt;height:260.2pt;width:165.55pt;mso-wrap-distance-bottom:0pt;mso-wrap-distance-left:9pt;mso-wrap-distance-right:9pt;mso-wrap-distance-top:0pt;z-index:251660288;mso-width-relative:page;mso-height-relative:page;" o:ole="t" filled="f" o:preferrelative="t" stroked="f" coordsize="21600,21600">
             <v:path/>
             <v:fill on="f" focussize="0,0"/>
             <v:stroke on="f" joinstyle="miter"/>
@@ -3766,7 +3592,7 @@
         <mc:AlternateContent>
           <mc:Choice Requires="wps">
             <w:drawing>
-              <wp:anchor distT="45720" distB="45720" distL="114300" distR="114300" simplePos="0" relativeHeight="251660288" behindDoc="0" locked="0" layoutInCell="1" allowOverlap="1">
+              <wp:anchor distT="45720" distB="45720" distL="114300" distR="114300" simplePos="0" relativeHeight="251659264" behindDoc="0" locked="0" layoutInCell="1" allowOverlap="1">
                 <wp:simplePos x="0" y="0"/>
                 <wp:positionH relativeFrom="column">
                   <wp:posOffset>4066540</wp:posOffset>
@@ -3833,7 +3659,7 @@
           </mc:Choice>
           <mc:Fallback>
             <w:pict>
-              <v:shape id="文本框 2" o:spid="_x0000_s1026" o:spt="202" type="#_x0000_t202" style="position:absolute;left:0pt;margin-left:320.2pt;margin-top:13.3pt;height:27pt;width:142.85pt;mso-wrap-distance-bottom:3.6pt;mso-wrap-distance-left:9pt;mso-wrap-distance-right:9pt;mso-wrap-distance-top:3.6pt;z-index:251660288;mso-width-relative:page;mso-height-relative:page;" fillcolor="#FFFFFF" filled="t" stroked="f" coordsize="21600,21600" o:gfxdata="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">
+              <v:shape id="文本框 2" o:spid="_x0000_s1026" o:spt="202" type="#_x0000_t202" style="position:absolute;left:0pt;margin-left:320.2pt;margin-top:13.3pt;height:27pt;width:142.85pt;mso-wrap-distance-bottom:3.6pt;mso-wrap-distance-left:9pt;mso-wrap-distance-right:9pt;mso-wrap-distance-top:3.6pt;z-index:251659264;mso-width-relative:page;mso-height-relative:page;" fillcolor="#FFFFFF" filled="t" stroked="f" coordsize="21600,21600" o:gfxdata="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">
                 <v:fill on="t" focussize="0,0"/>
                 <v:stroke on="f" miterlimit="8" joinstyle="miter"/>
                 <v:imagedata o:title=""/>
@@ -4064,22 +3890,6 @@
         <w:gridCol w:w="4730"/>
       </w:tblGrid>
       <w:tr>
-        <w:tblPrEx>
-          <w:tblBorders>
-            <w:top w:val="single" w:color="auto" w:sz="4" w:space="0"/>
-            <w:left w:val="single" w:color="auto" w:sz="4" w:space="0"/>
-            <w:bottom w:val="single" w:color="auto" w:sz="4" w:space="0"/>
-            <w:right w:val="single" w:color="auto" w:sz="4" w:space="0"/>
-            <w:insideH w:val="single" w:color="auto" w:sz="4" w:space="0"/>
-            <w:insideV w:val="single" w:color="auto" w:sz="4" w:space="0"/>
-          </w:tblBorders>
-          <w:tblCellMar>
-            <w:top w:w="0" w:type="dxa"/>
-            <w:left w:w="108" w:type="dxa"/>
-            <w:bottom w:w="0" w:type="dxa"/>
-            <w:right w:w="108" w:type="dxa"/>
-          </w:tblCellMar>
-        </w:tblPrEx>
         <w:tc>
           <w:tcPr>
             <w:tcW w:w="704" w:type="dxa"/>
@@ -4145,22 +3955,6 @@
         </w:tc>
       </w:tr>
       <w:tr>
-        <w:tblPrEx>
-          <w:tblBorders>
-            <w:top w:val="single" w:color="auto" w:sz="4" w:space="0"/>
-            <w:left w:val="single" w:color="auto" w:sz="4" w:space="0"/>
-            <w:bottom w:val="single" w:color="auto" w:sz="4" w:space="0"/>
-            <w:right w:val="single" w:color="auto" w:sz="4" w:space="0"/>
-            <w:insideH w:val="single" w:color="auto" w:sz="4" w:space="0"/>
-            <w:insideV w:val="single" w:color="auto" w:sz="4" w:space="0"/>
-          </w:tblBorders>
-          <w:tblCellMar>
-            <w:top w:w="0" w:type="dxa"/>
-            <w:left w:w="108" w:type="dxa"/>
-            <w:bottom w:w="0" w:type="dxa"/>
-            <w:right w:w="108" w:type="dxa"/>
-          </w:tblCellMar>
-        </w:tblPrEx>
         <w:tc>
           <w:tcPr>
             <w:tcW w:w="704" w:type="dxa"/>
@@ -4216,22 +4010,6 @@
         </w:tc>
       </w:tr>
       <w:tr>
-        <w:tblPrEx>
-          <w:tblBorders>
-            <w:top w:val="single" w:color="auto" w:sz="4" w:space="0"/>
-            <w:left w:val="single" w:color="auto" w:sz="4" w:space="0"/>
-            <w:bottom w:val="single" w:color="auto" w:sz="4" w:space="0"/>
-            <w:right w:val="single" w:color="auto" w:sz="4" w:space="0"/>
-            <w:insideH w:val="single" w:color="auto" w:sz="4" w:space="0"/>
-            <w:insideV w:val="single" w:color="auto" w:sz="4" w:space="0"/>
-          </w:tblBorders>
-          <w:tblCellMar>
-            <w:top w:w="0" w:type="dxa"/>
-            <w:left w:w="108" w:type="dxa"/>
-            <w:bottom w:w="0" w:type="dxa"/>
-            <w:right w:w="108" w:type="dxa"/>
-          </w:tblCellMar>
-        </w:tblPrEx>
         <w:tc>
           <w:tcPr>
             <w:tcW w:w="704" w:type="dxa"/>
@@ -4285,22 +4063,6 @@
         </w:tc>
       </w:tr>
       <w:tr>
-        <w:tblPrEx>
-          <w:tblBorders>
-            <w:top w:val="single" w:color="auto" w:sz="4" w:space="0"/>
-            <w:left w:val="single" w:color="auto" w:sz="4" w:space="0"/>
-            <w:bottom w:val="single" w:color="auto" w:sz="4" w:space="0"/>
-            <w:right w:val="single" w:color="auto" w:sz="4" w:space="0"/>
-            <w:insideH w:val="single" w:color="auto" w:sz="4" w:space="0"/>
-            <w:insideV w:val="single" w:color="auto" w:sz="4" w:space="0"/>
-          </w:tblBorders>
-          <w:tblCellMar>
-            <w:top w:w="0" w:type="dxa"/>
-            <w:left w:w="108" w:type="dxa"/>
-            <w:bottom w:w="0" w:type="dxa"/>
-            <w:right w:w="108" w:type="dxa"/>
-          </w:tblCellMar>
-        </w:tblPrEx>
         <w:trPr>
           <w:trHeight w:val="50" w:hRule="atLeast"/>
         </w:trPr>
@@ -4357,22 +4119,6 @@
         </w:tc>
       </w:tr>
       <w:tr>
-        <w:tblPrEx>
-          <w:tblBorders>
-            <w:top w:val="single" w:color="auto" w:sz="4" w:space="0"/>
-            <w:left w:val="single" w:color="auto" w:sz="4" w:space="0"/>
-            <w:bottom w:val="single" w:color="auto" w:sz="4" w:space="0"/>
-            <w:right w:val="single" w:color="auto" w:sz="4" w:space="0"/>
-            <w:insideH w:val="single" w:color="auto" w:sz="4" w:space="0"/>
-            <w:insideV w:val="single" w:color="auto" w:sz="4" w:space="0"/>
-          </w:tblBorders>
-          <w:tblCellMar>
-            <w:top w:w="0" w:type="dxa"/>
-            <w:left w:w="108" w:type="dxa"/>
-            <w:bottom w:w="0" w:type="dxa"/>
-            <w:right w:w="108" w:type="dxa"/>
-          </w:tblCellMar>
-        </w:tblPrEx>
         <w:tc>
           <w:tcPr>
             <w:tcW w:w="704" w:type="dxa"/>
@@ -4426,22 +4172,6 @@
         </w:tc>
       </w:tr>
       <w:tr>
-        <w:tblPrEx>
-          <w:tblBorders>
-            <w:top w:val="single" w:color="auto" w:sz="4" w:space="0"/>
-            <w:left w:val="single" w:color="auto" w:sz="4" w:space="0"/>
-            <w:bottom w:val="single" w:color="auto" w:sz="4" w:space="0"/>
-            <w:right w:val="single" w:color="auto" w:sz="4" w:space="0"/>
-            <w:insideH w:val="single" w:color="auto" w:sz="4" w:space="0"/>
-            <w:insideV w:val="single" w:color="auto" w:sz="4" w:space="0"/>
-          </w:tblBorders>
-          <w:tblCellMar>
-            <w:top w:w="0" w:type="dxa"/>
-            <w:left w:w="108" w:type="dxa"/>
-            <w:bottom w:w="0" w:type="dxa"/>
-            <w:right w:w="108" w:type="dxa"/>
-          </w:tblCellMar>
-        </w:tblPrEx>
         <w:tc>
           <w:tcPr>
             <w:tcW w:w="704" w:type="dxa"/>
@@ -4495,22 +4225,6 @@
         </w:tc>
       </w:tr>
       <w:tr>
-        <w:tblPrEx>
-          <w:tblBorders>
-            <w:top w:val="single" w:color="auto" w:sz="4" w:space="0"/>
-            <w:left w:val="single" w:color="auto" w:sz="4" w:space="0"/>
-            <w:bottom w:val="single" w:color="auto" w:sz="4" w:space="0"/>
-            <w:right w:val="single" w:color="auto" w:sz="4" w:space="0"/>
-            <w:insideH w:val="single" w:color="auto" w:sz="4" w:space="0"/>
-            <w:insideV w:val="single" w:color="auto" w:sz="4" w:space="0"/>
-          </w:tblBorders>
-          <w:tblCellMar>
-            <w:top w:w="0" w:type="dxa"/>
-            <w:left w:w="108" w:type="dxa"/>
-            <w:bottom w:w="0" w:type="dxa"/>
-            <w:right w:w="108" w:type="dxa"/>
-          </w:tblCellMar>
-        </w:tblPrEx>
         <w:tc>
           <w:tcPr>
             <w:tcW w:w="704" w:type="dxa"/>
@@ -4564,22 +4278,6 @@
         </w:tc>
       </w:tr>
       <w:tr>
-        <w:tblPrEx>
-          <w:tblBorders>
-            <w:top w:val="single" w:color="auto" w:sz="4" w:space="0"/>
-            <w:left w:val="single" w:color="auto" w:sz="4" w:space="0"/>
-            <w:bottom w:val="single" w:color="auto" w:sz="4" w:space="0"/>
-            <w:right w:val="single" w:color="auto" w:sz="4" w:space="0"/>
-            <w:insideH w:val="single" w:color="auto" w:sz="4" w:space="0"/>
-            <w:insideV w:val="single" w:color="auto" w:sz="4" w:space="0"/>
-          </w:tblBorders>
-          <w:tblCellMar>
-            <w:top w:w="0" w:type="dxa"/>
-            <w:left w:w="108" w:type="dxa"/>
-            <w:bottom w:w="0" w:type="dxa"/>
-            <w:right w:w="108" w:type="dxa"/>
-          </w:tblCellMar>
-        </w:tblPrEx>
         <w:tc>
           <w:tcPr>
             <w:tcW w:w="704" w:type="dxa"/>
@@ -4633,22 +4331,6 @@
         </w:tc>
       </w:tr>
       <w:tr>
-        <w:tblPrEx>
-          <w:tblBorders>
-            <w:top w:val="single" w:color="auto" w:sz="4" w:space="0"/>
-            <w:left w:val="single" w:color="auto" w:sz="4" w:space="0"/>
-            <w:bottom w:val="single" w:color="auto" w:sz="4" w:space="0"/>
-            <w:right w:val="single" w:color="auto" w:sz="4" w:space="0"/>
-            <w:insideH w:val="single" w:color="auto" w:sz="4" w:space="0"/>
-            <w:insideV w:val="single" w:color="auto" w:sz="4" w:space="0"/>
-          </w:tblBorders>
-          <w:tblCellMar>
-            <w:top w:w="0" w:type="dxa"/>
-            <w:left w:w="108" w:type="dxa"/>
-            <w:bottom w:w="0" w:type="dxa"/>
-            <w:right w:w="108" w:type="dxa"/>
-          </w:tblCellMar>
-        </w:tblPrEx>
         <w:tc>
           <w:tcPr>
             <w:tcW w:w="704" w:type="dxa"/>
@@ -4705,22 +4387,6 @@
         </w:tc>
       </w:tr>
       <w:tr>
-        <w:tblPrEx>
-          <w:tblBorders>
-            <w:top w:val="single" w:color="auto" w:sz="4" w:space="0"/>
-            <w:left w:val="single" w:color="auto" w:sz="4" w:space="0"/>
-            <w:bottom w:val="single" w:color="auto" w:sz="4" w:space="0"/>
-            <w:right w:val="single" w:color="auto" w:sz="4" w:space="0"/>
-            <w:insideH w:val="single" w:color="auto" w:sz="4" w:space="0"/>
-            <w:insideV w:val="single" w:color="auto" w:sz="4" w:space="0"/>
-          </w:tblBorders>
-          <w:tblCellMar>
-            <w:top w:w="0" w:type="dxa"/>
-            <w:left w:w="108" w:type="dxa"/>
-            <w:bottom w:w="0" w:type="dxa"/>
-            <w:right w:w="108" w:type="dxa"/>
-          </w:tblCellMar>
-        </w:tblPrEx>
         <w:tc>
           <w:tcPr>
             <w:tcW w:w="704" w:type="dxa"/>
@@ -4777,22 +4443,6 @@
         </w:tc>
       </w:tr>
       <w:tr>
-        <w:tblPrEx>
-          <w:tblBorders>
-            <w:top w:val="single" w:color="auto" w:sz="4" w:space="0"/>
-            <w:left w:val="single" w:color="auto" w:sz="4" w:space="0"/>
-            <w:bottom w:val="single" w:color="auto" w:sz="4" w:space="0"/>
-            <w:right w:val="single" w:color="auto" w:sz="4" w:space="0"/>
-            <w:insideH w:val="single" w:color="auto" w:sz="4" w:space="0"/>
-            <w:insideV w:val="single" w:color="auto" w:sz="4" w:space="0"/>
-          </w:tblBorders>
-          <w:tblCellMar>
-            <w:top w:w="0" w:type="dxa"/>
-            <w:left w:w="108" w:type="dxa"/>
-            <w:bottom w:w="0" w:type="dxa"/>
-            <w:right w:w="108" w:type="dxa"/>
-          </w:tblCellMar>
-        </w:tblPrEx>
         <w:tc>
           <w:tcPr>
             <w:tcW w:w="704" w:type="dxa"/>
@@ -4849,22 +4499,6 @@
         </w:tc>
       </w:tr>
       <w:tr>
-        <w:tblPrEx>
-          <w:tblBorders>
-            <w:top w:val="single" w:color="auto" w:sz="4" w:space="0"/>
-            <w:left w:val="single" w:color="auto" w:sz="4" w:space="0"/>
-            <w:bottom w:val="single" w:color="auto" w:sz="4" w:space="0"/>
-            <w:right w:val="single" w:color="auto" w:sz="4" w:space="0"/>
-            <w:insideH w:val="single" w:color="auto" w:sz="4" w:space="0"/>
-            <w:insideV w:val="single" w:color="auto" w:sz="4" w:space="0"/>
-          </w:tblBorders>
-          <w:tblCellMar>
-            <w:top w:w="0" w:type="dxa"/>
-            <w:left w:w="108" w:type="dxa"/>
-            <w:bottom w:w="0" w:type="dxa"/>
-            <w:right w:w="108" w:type="dxa"/>
-          </w:tblCellMar>
-        </w:tblPrEx>
         <w:tc>
           <w:tcPr>
             <w:tcW w:w="704" w:type="dxa"/>
@@ -4921,22 +4555,6 @@
         </w:tc>
       </w:tr>
       <w:tr>
-        <w:tblPrEx>
-          <w:tblBorders>
-            <w:top w:val="single" w:color="auto" w:sz="4" w:space="0"/>
-            <w:left w:val="single" w:color="auto" w:sz="4" w:space="0"/>
-            <w:bottom w:val="single" w:color="auto" w:sz="4" w:space="0"/>
-            <w:right w:val="single" w:color="auto" w:sz="4" w:space="0"/>
-            <w:insideH w:val="single" w:color="auto" w:sz="4" w:space="0"/>
-            <w:insideV w:val="single" w:color="auto" w:sz="4" w:space="0"/>
-          </w:tblBorders>
-          <w:tblCellMar>
-            <w:top w:w="0" w:type="dxa"/>
-            <w:left w:w="108" w:type="dxa"/>
-            <w:bottom w:w="0" w:type="dxa"/>
-            <w:right w:w="108" w:type="dxa"/>
-          </w:tblCellMar>
-        </w:tblPrEx>
         <w:tc>
           <w:tcPr>
             <w:tcW w:w="704" w:type="dxa"/>
@@ -4993,22 +4611,6 @@
         </w:tc>
       </w:tr>
       <w:tr>
-        <w:tblPrEx>
-          <w:tblBorders>
-            <w:top w:val="single" w:color="auto" w:sz="4" w:space="0"/>
-            <w:left w:val="single" w:color="auto" w:sz="4" w:space="0"/>
-            <w:bottom w:val="single" w:color="auto" w:sz="4" w:space="0"/>
-            <w:right w:val="single" w:color="auto" w:sz="4" w:space="0"/>
-            <w:insideH w:val="single" w:color="auto" w:sz="4" w:space="0"/>
-            <w:insideV w:val="single" w:color="auto" w:sz="4" w:space="0"/>
-          </w:tblBorders>
-          <w:tblCellMar>
-            <w:top w:w="0" w:type="dxa"/>
-            <w:left w:w="108" w:type="dxa"/>
-            <w:bottom w:w="0" w:type="dxa"/>
-            <w:right w:w="108" w:type="dxa"/>
-          </w:tblCellMar>
-        </w:tblPrEx>
         <w:tc>
           <w:tcPr>
             <w:tcW w:w="704" w:type="dxa"/>
@@ -5065,22 +4667,6 @@
         </w:tc>
       </w:tr>
       <w:tr>
-        <w:tblPrEx>
-          <w:tblBorders>
-            <w:top w:val="single" w:color="auto" w:sz="4" w:space="0"/>
-            <w:left w:val="single" w:color="auto" w:sz="4" w:space="0"/>
-            <w:bottom w:val="single" w:color="auto" w:sz="4" w:space="0"/>
-            <w:right w:val="single" w:color="auto" w:sz="4" w:space="0"/>
-            <w:insideH w:val="single" w:color="auto" w:sz="4" w:space="0"/>
-            <w:insideV w:val="single" w:color="auto" w:sz="4" w:space="0"/>
-          </w:tblBorders>
-          <w:tblCellMar>
-            <w:top w:w="0" w:type="dxa"/>
-            <w:left w:w="108" w:type="dxa"/>
-            <w:bottom w:w="0" w:type="dxa"/>
-            <w:right w:w="108" w:type="dxa"/>
-          </w:tblCellMar>
-        </w:tblPrEx>
         <w:tc>
           <w:tcPr>
             <w:tcW w:w="704" w:type="dxa"/>
@@ -5137,22 +4723,6 @@
         </w:tc>
       </w:tr>
       <w:tr>
-        <w:tblPrEx>
-          <w:tblBorders>
-            <w:top w:val="single" w:color="auto" w:sz="4" w:space="0"/>
-            <w:left w:val="single" w:color="auto" w:sz="4" w:space="0"/>
-            <w:bottom w:val="single" w:color="auto" w:sz="4" w:space="0"/>
-            <w:right w:val="single" w:color="auto" w:sz="4" w:space="0"/>
-            <w:insideH w:val="single" w:color="auto" w:sz="4" w:space="0"/>
-            <w:insideV w:val="single" w:color="auto" w:sz="4" w:space="0"/>
-          </w:tblBorders>
-          <w:tblCellMar>
-            <w:top w:w="0" w:type="dxa"/>
-            <w:left w:w="108" w:type="dxa"/>
-            <w:bottom w:w="0" w:type="dxa"/>
-            <w:right w:w="108" w:type="dxa"/>
-          </w:tblCellMar>
-        </w:tblPrEx>
         <w:tc>
           <w:tcPr>
             <w:tcW w:w="704" w:type="dxa"/>
@@ -5209,22 +4779,6 @@
         </w:tc>
       </w:tr>
       <w:tr>
-        <w:tblPrEx>
-          <w:tblBorders>
-            <w:top w:val="single" w:color="auto" w:sz="4" w:space="0"/>
-            <w:left w:val="single" w:color="auto" w:sz="4" w:space="0"/>
-            <w:bottom w:val="single" w:color="auto" w:sz="4" w:space="0"/>
-            <w:right w:val="single" w:color="auto" w:sz="4" w:space="0"/>
-            <w:insideH w:val="single" w:color="auto" w:sz="4" w:space="0"/>
-            <w:insideV w:val="single" w:color="auto" w:sz="4" w:space="0"/>
-          </w:tblBorders>
-          <w:tblCellMar>
-            <w:top w:w="0" w:type="dxa"/>
-            <w:left w:w="108" w:type="dxa"/>
-            <w:bottom w:w="0" w:type="dxa"/>
-            <w:right w:w="108" w:type="dxa"/>
-          </w:tblCellMar>
-        </w:tblPrEx>
         <w:tc>
           <w:tcPr>
             <w:tcW w:w="704" w:type="dxa"/>
@@ -5666,15 +5220,7 @@
         <w:rPr>
           <w:rFonts w:hint="eastAsia"/>
         </w:rPr>
-        <w:t>界面，在界面编辑器中拖</w:t>
-      </w:r>
-      <w:bookmarkStart w:id="11" w:name="_GoBack"/>
-      <w:bookmarkEnd w:id="11"/>
-      <w:r>
-        <w:rPr>
-          <w:rFonts w:hint="eastAsia"/>
-        </w:rPr>
-        <w:t>e</w:t>
+        <w:t>界面，在界面编辑器中拖e</w:t>
       </w:r>
       <w:r>
         <w:t>bview</w:t>
@@ -7834,8 +7380,26 @@
           <w:sz w:val="17"/>
         </w:rPr>
         <w:t>&lt;uses-permission android:name="android.permission.INTERNET" /&gt;</w:t>
-        <w:br/>
-        <w:br/>
+      </w:r>
+      <w:r>
+        <w:rPr>
+          <w:rFonts w:ascii="Consolas" w:hAnsi="Consolas" w:eastAsia="Consolas"/>
+          <w:sz w:val="17"/>
+        </w:rPr>
+        <w:br w:type="textWrapping"/>
+      </w:r>
+      <w:r>
+        <w:rPr>
+          <w:rFonts w:ascii="Consolas" w:hAnsi="Consolas" w:eastAsia="Consolas"/>
+          <w:sz w:val="17"/>
+        </w:rPr>
+        <w:br w:type="textWrapping"/>
+      </w:r>
+      <w:r>
+        <w:rPr>
+          <w:rFonts w:ascii="Consolas" w:hAnsi="Consolas" w:eastAsia="Consolas"/>
+          <w:sz w:val="17"/>
+        </w:rPr>
         <w:t>implementation libs.material</w:t>
       </w:r>
     </w:p>
@@ -7866,49 +7430,313 @@
           <w:sz w:val="17"/>
         </w:rPr>
         <w:t>&lt;WebView</w:t>
-        <w:br/>
+      </w:r>
+      <w:r>
+        <w:rPr>
+          <w:rFonts w:ascii="Consolas" w:hAnsi="Consolas" w:eastAsia="Consolas"/>
+          <w:sz w:val="17"/>
+        </w:rPr>
+        <w:br w:type="textWrapping"/>
+      </w:r>
+      <w:r>
+        <w:rPr>
+          <w:rFonts w:ascii="Consolas" w:hAnsi="Consolas" w:eastAsia="Consolas"/>
+          <w:sz w:val="17"/>
+        </w:rPr>
         <w:t xml:space="preserve">    android:id="@+id/webview"</w:t>
-        <w:br/>
+      </w:r>
+      <w:r>
+        <w:rPr>
+          <w:rFonts w:ascii="Consolas" w:hAnsi="Consolas" w:eastAsia="Consolas"/>
+          <w:sz w:val="17"/>
+        </w:rPr>
+        <w:br w:type="textWrapping"/>
+      </w:r>
+      <w:r>
+        <w:rPr>
+          <w:rFonts w:ascii="Consolas" w:hAnsi="Consolas" w:eastAsia="Consolas"/>
+          <w:sz w:val="17"/>
+        </w:rPr>
         <w:t xml:space="preserve">    android:layout_width="match_parent"</w:t>
-        <w:br/>
+      </w:r>
+      <w:r>
+        <w:rPr>
+          <w:rFonts w:ascii="Consolas" w:hAnsi="Consolas" w:eastAsia="Consolas"/>
+          <w:sz w:val="17"/>
+        </w:rPr>
+        <w:br w:type="textWrapping"/>
+      </w:r>
+      <w:r>
+        <w:rPr>
+          <w:rFonts w:ascii="Consolas" w:hAnsi="Consolas" w:eastAsia="Consolas"/>
+          <w:sz w:val="17"/>
+        </w:rPr>
         <w:t xml:space="preserve">    android:layout_height="350dp"</w:t>
-        <w:br/>
+      </w:r>
+      <w:r>
+        <w:rPr>
+          <w:rFonts w:ascii="Consolas" w:hAnsi="Consolas" w:eastAsia="Consolas"/>
+          <w:sz w:val="17"/>
+        </w:rPr>
+        <w:br w:type="textWrapping"/>
+      </w:r>
+      <w:r>
+        <w:rPr>
+          <w:rFonts w:ascii="Consolas" w:hAnsi="Consolas" w:eastAsia="Consolas"/>
+          <w:sz w:val="17"/>
+        </w:rPr>
         <w:t xml:space="preserve">    android:layout_marginLeft="12dp"</w:t>
-        <w:br/>
+      </w:r>
+      <w:r>
+        <w:rPr>
+          <w:rFonts w:ascii="Consolas" w:hAnsi="Consolas" w:eastAsia="Consolas"/>
+          <w:sz w:val="17"/>
+        </w:rPr>
+        <w:br w:type="textWrapping"/>
+      </w:r>
+      <w:r>
+        <w:rPr>
+          <w:rFonts w:ascii="Consolas" w:hAnsi="Consolas" w:eastAsia="Consolas"/>
+          <w:sz w:val="17"/>
+        </w:rPr>
         <w:t xml:space="preserve">    android:layout_marginRight="12dp" /&gt;</w:t>
-        <w:br/>
-        <w:br/>
+      </w:r>
+      <w:r>
+        <w:rPr>
+          <w:rFonts w:ascii="Consolas" w:hAnsi="Consolas" w:eastAsia="Consolas"/>
+          <w:sz w:val="17"/>
+        </w:rPr>
+        <w:br w:type="textWrapping"/>
+      </w:r>
+      <w:r>
+        <w:rPr>
+          <w:rFonts w:ascii="Consolas" w:hAnsi="Consolas" w:eastAsia="Consolas"/>
+          <w:sz w:val="17"/>
+        </w:rPr>
+        <w:br w:type="textWrapping"/>
+      </w:r>
+      <w:r>
+        <w:rPr>
+          <w:rFonts w:ascii="Consolas" w:hAnsi="Consolas" w:eastAsia="Consolas"/>
+          <w:sz w:val="17"/>
+        </w:rPr>
         <w:t>&lt;ProgressBar</w:t>
-        <w:br/>
+      </w:r>
+      <w:r>
+        <w:rPr>
+          <w:rFonts w:ascii="Consolas" w:hAnsi="Consolas" w:eastAsia="Consolas"/>
+          <w:sz w:val="17"/>
+        </w:rPr>
+        <w:br w:type="textWrapping"/>
+      </w:r>
+      <w:r>
+        <w:rPr>
+          <w:rFonts w:ascii="Consolas" w:hAnsi="Consolas" w:eastAsia="Consolas"/>
+          <w:sz w:val="17"/>
+        </w:rPr>
         <w:t xml:space="preserve">    android:id="@+id/progressbar"</w:t>
-        <w:br/>
+      </w:r>
+      <w:r>
+        <w:rPr>
+          <w:rFonts w:ascii="Consolas" w:hAnsi="Consolas" w:eastAsia="Consolas"/>
+          <w:sz w:val="17"/>
+        </w:rPr>
+        <w:br w:type="textWrapping"/>
+      </w:r>
+      <w:r>
+        <w:rPr>
+          <w:rFonts w:ascii="Consolas" w:hAnsi="Consolas" w:eastAsia="Consolas"/>
+          <w:sz w:val="17"/>
+        </w:rPr>
         <w:t xml:space="preserve">    style="?android:attr/progressBarStyleHorizontal"</w:t>
-        <w:br/>
+      </w:r>
+      <w:r>
+        <w:rPr>
+          <w:rFonts w:ascii="Consolas" w:hAnsi="Consolas" w:eastAsia="Consolas"/>
+          <w:sz w:val="17"/>
+        </w:rPr>
+        <w:br w:type="textWrapping"/>
+      </w:r>
+      <w:r>
+        <w:rPr>
+          <w:rFonts w:ascii="Consolas" w:hAnsi="Consolas" w:eastAsia="Consolas"/>
+          <w:sz w:val="17"/>
+        </w:rPr>
         <w:t xml:space="preserve">    android:layout_width="match_parent"</w:t>
-        <w:br/>
+      </w:r>
+      <w:r>
+        <w:rPr>
+          <w:rFonts w:ascii="Consolas" w:hAnsi="Consolas" w:eastAsia="Consolas"/>
+          <w:sz w:val="17"/>
+        </w:rPr>
+        <w:br w:type="textWrapping"/>
+      </w:r>
+      <w:r>
+        <w:rPr>
+          <w:rFonts w:ascii="Consolas" w:hAnsi="Consolas" w:eastAsia="Consolas"/>
+          <w:sz w:val="17"/>
+        </w:rPr>
         <w:t xml:space="preserve">    android:layout_height="wrap_content"</w:t>
-        <w:br/>
+      </w:r>
+      <w:r>
+        <w:rPr>
+          <w:rFonts w:ascii="Consolas" w:hAnsi="Consolas" w:eastAsia="Consolas"/>
+          <w:sz w:val="17"/>
+        </w:rPr>
+        <w:br w:type="textWrapping"/>
+      </w:r>
+      <w:r>
+        <w:rPr>
+          <w:rFonts w:ascii="Consolas" w:hAnsi="Consolas" w:eastAsia="Consolas"/>
+          <w:sz w:val="17"/>
+        </w:rPr>
         <w:t xml:space="preserve">    android:layout_alignLeft="@id/webview"</w:t>
-        <w:br/>
+      </w:r>
+      <w:r>
+        <w:rPr>
+          <w:rFonts w:ascii="Consolas" w:hAnsi="Consolas" w:eastAsia="Consolas"/>
+          <w:sz w:val="17"/>
+        </w:rPr>
+        <w:br w:type="textWrapping"/>
+      </w:r>
+      <w:r>
+        <w:rPr>
+          <w:rFonts w:ascii="Consolas" w:hAnsi="Consolas" w:eastAsia="Consolas"/>
+          <w:sz w:val="17"/>
+        </w:rPr>
         <w:t xml:space="preserve">    android:layout_below="@id/webview"</w:t>
-        <w:br/>
+      </w:r>
+      <w:r>
+        <w:rPr>
+          <w:rFonts w:ascii="Consolas" w:hAnsi="Consolas" w:eastAsia="Consolas"/>
+          <w:sz w:val="17"/>
+        </w:rPr>
+        <w:br w:type="textWrapping"/>
+      </w:r>
+      <w:r>
+        <w:rPr>
+          <w:rFonts w:ascii="Consolas" w:hAnsi="Consolas" w:eastAsia="Consolas"/>
+          <w:sz w:val="17"/>
+        </w:rPr>
         <w:t xml:space="preserve">    android:visibility="invisible" /&gt;</w:t>
-        <w:br/>
-        <w:br/>
+      </w:r>
+      <w:r>
+        <w:rPr>
+          <w:rFonts w:ascii="Consolas" w:hAnsi="Consolas" w:eastAsia="Consolas"/>
+          <w:sz w:val="17"/>
+        </w:rPr>
+        <w:br w:type="textWrapping"/>
+      </w:r>
+      <w:r>
+        <w:rPr>
+          <w:rFonts w:ascii="Consolas" w:hAnsi="Consolas" w:eastAsia="Consolas"/>
+          <w:sz w:val="17"/>
+        </w:rPr>
+        <w:br w:type="textWrapping"/>
+      </w:r>
+      <w:r>
+        <w:rPr>
+          <w:rFonts w:ascii="Consolas" w:hAnsi="Consolas" w:eastAsia="Consolas"/>
+          <w:sz w:val="17"/>
+        </w:rPr>
         <w:t>&lt;com.google.android.material.floatingactionbutton.FloatingActionButton</w:t>
-        <w:br/>
+      </w:r>
+      <w:r>
+        <w:rPr>
+          <w:rFonts w:ascii="Consolas" w:hAnsi="Consolas" w:eastAsia="Consolas"/>
+          <w:sz w:val="17"/>
+        </w:rPr>
+        <w:br w:type="textWrapping"/>
+      </w:r>
+      <w:r>
+        <w:rPr>
+          <w:rFonts w:ascii="Consolas" w:hAnsi="Consolas" w:eastAsia="Consolas"/>
+          <w:sz w:val="17"/>
+        </w:rPr>
         <w:t xml:space="preserve">    android:id="@+id/floatingactionbutton"</w:t>
-        <w:br/>
+      </w:r>
+      <w:r>
+        <w:rPr>
+          <w:rFonts w:ascii="Consolas" w:hAnsi="Consolas" w:eastAsia="Consolas"/>
+          <w:sz w:val="17"/>
+        </w:rPr>
+        <w:br w:type="textWrapping"/>
+      </w:r>
+      <w:r>
+        <w:rPr>
+          <w:rFonts w:ascii="Consolas" w:hAnsi="Consolas" w:eastAsia="Consolas"/>
+          <w:sz w:val="17"/>
+        </w:rPr>
         <w:t xml:space="preserve">    android:layout_alignParentBottom="true"</w:t>
-        <w:br/>
+      </w:r>
+      <w:r>
+        <w:rPr>
+          <w:rFonts w:ascii="Consolas" w:hAnsi="Consolas" w:eastAsia="Consolas"/>
+          <w:sz w:val="17"/>
+        </w:rPr>
+        <w:br w:type="textWrapping"/>
+      </w:r>
+      <w:r>
+        <w:rPr>
+          <w:rFonts w:ascii="Consolas" w:hAnsi="Consolas" w:eastAsia="Consolas"/>
+          <w:sz w:val="17"/>
+        </w:rPr>
         <w:t xml:space="preserve">    android:layout_marginLeft="30dp"</w:t>
-        <w:br/>
+      </w:r>
+      <w:r>
+        <w:rPr>
+          <w:rFonts w:ascii="Consolas" w:hAnsi="Consolas" w:eastAsia="Consolas"/>
+          <w:sz w:val="17"/>
+        </w:rPr>
+        <w:br w:type="textWrapping"/>
+      </w:r>
+      <w:r>
+        <w:rPr>
+          <w:rFonts w:ascii="Consolas" w:hAnsi="Consolas" w:eastAsia="Consolas"/>
+          <w:sz w:val="17"/>
+        </w:rPr>
         <w:t xml:space="preserve">    android:layout_marginBottom="46dp"</w:t>
-        <w:br/>
+      </w:r>
+      <w:r>
+        <w:rPr>
+          <w:rFonts w:ascii="Consolas" w:hAnsi="Consolas" w:eastAsia="Consolas"/>
+          <w:sz w:val="17"/>
+        </w:rPr>
+        <w:br w:type="textWrapping"/>
+      </w:r>
+      <w:r>
+        <w:rPr>
+          <w:rFonts w:ascii="Consolas" w:hAnsi="Consolas" w:eastAsia="Consolas"/>
+          <w:sz w:val="17"/>
+        </w:rPr>
         <w:t xml:space="preserve">    android:onClick="onViewClicked"</w:t>
-        <w:br/>
+      </w:r>
+      <w:r>
+        <w:rPr>
+          <w:rFonts w:ascii="Consolas" w:hAnsi="Consolas" w:eastAsia="Consolas"/>
+          <w:sz w:val="17"/>
+        </w:rPr>
+        <w:br w:type="textWrapping"/>
+      </w:r>
+      <w:r>
+        <w:rPr>
+          <w:rFonts w:ascii="Consolas" w:hAnsi="Consolas" w:eastAsia="Consolas"/>
+          <w:sz w:val="17"/>
+        </w:rPr>
         <w:t xml:space="preserve">    android:src="@mipmap/add"</w:t>
-        <w:br/>
+      </w:r>
+      <w:r>
+        <w:rPr>
+          <w:rFonts w:ascii="Consolas" w:hAnsi="Consolas" w:eastAsia="Consolas"/>
+          <w:sz w:val="17"/>
+        </w:rPr>
+        <w:br w:type="textWrapping"/>
+      </w:r>
+      <w:r>
+        <w:rPr>
+          <w:rFonts w:ascii="Consolas" w:hAnsi="Consolas" w:eastAsia="Consolas"/>
+          <w:sz w:val="17"/>
+        </w:rPr>
         <w:t xml:space="preserve">    app:backgroundTint="@color/colorAccent" /&gt;</w:t>
       </w:r>
     </w:p>
@@ -7939,74 +7767,434 @@
           <w:sz w:val="17"/>
         </w:rPr>
         <w:t>private final Handler updateBarHandler = new Handler(Looper.getMainLooper()) {</w:t>
-        <w:br/>
-        <w:t xml:space="preserve">    @Override</w:t>
-        <w:br/>
-        <w:t xml:space="preserve">    public void handleMessage(@NonNull Message msg) {</w:t>
-        <w:br/>
-        <w:t xml:space="preserve">        int currentProgress = msg.arg1;</w:t>
-        <w:br/>
-        <w:t xml:space="preserve">        if (currentProgress &lt;= 100) {</w:t>
-        <w:br/>
-        <w:t xml:space="preserve">            progressbar.setProgress(currentProgress);</w:t>
-        <w:br/>
-        <w:t xml:space="preserve">            updateBarHandler.postDelayed(updateThread, 1000);</w:t>
-        <w:br/>
-        <w:t xml:space="preserve">        } else {</w:t>
-        <w:br/>
-        <w:t xml:space="preserve">            progressValue = 0;</w:t>
-        <w:br/>
-        <w:t xml:space="preserve">            progressbar.setProgress(progressValue);</w:t>
-        <w:br/>
-        <w:t xml:space="preserve">            progressbar.setVisibility(View.INVISIBLE);</w:t>
-        <w:br/>
-        <w:t xml:space="preserve">            updateBarHandler.removeCallbacks(updateThread);</w:t>
-        <w:br/>
-        <w:t xml:space="preserve">            Snackbar.make(floatingactionbutton, "网页已打开！", Snackbar.LENGTH_LONG)</w:t>
-        <w:br/>
-        <w:t xml:space="preserve">                    .setAction("确定", view -&gt; Toast.makeText(</w:t>
-        <w:br/>
-        <w:t xml:space="preserve">                            MainActivity.this, "网页已打开！", Toast.LENGTH_SHORT).show())</w:t>
-        <w:br/>
-        <w:t xml:space="preserve">                    .show();</w:t>
-        <w:br/>
-        <w:t xml:space="preserve">        }</w:t>
-        <w:br/>
-        <w:t xml:space="preserve">    }</w:t>
-        <w:br/>
-        <w:t>};</w:t>
-      </w:r>
-    </w:p>
-    <w:p>
+      </w:r>
       <w:r>
         <w:rPr>
           <w:rFonts w:ascii="Consolas" w:hAnsi="Consolas" w:eastAsia="Consolas"/>
           <w:sz w:val="17"/>
         </w:rPr>
+        <w:br w:type="textWrapping"/>
+      </w:r>
+      <w:r>
+        <w:rPr>
+          <w:rFonts w:ascii="Consolas" w:hAnsi="Consolas" w:eastAsia="Consolas"/>
+          <w:sz w:val="17"/>
+        </w:rPr>
+        <w:t xml:space="preserve">    @Override</w:t>
+      </w:r>
+      <w:r>
+        <w:rPr>
+          <w:rFonts w:ascii="Consolas" w:hAnsi="Consolas" w:eastAsia="Consolas"/>
+          <w:sz w:val="17"/>
+        </w:rPr>
+        <w:br w:type="textWrapping"/>
+      </w:r>
+      <w:r>
+        <w:rPr>
+          <w:rFonts w:ascii="Consolas" w:hAnsi="Consolas" w:eastAsia="Consolas"/>
+          <w:sz w:val="17"/>
+        </w:rPr>
+        <w:t xml:space="preserve">    public void handleMessage(@NonNull Message msg) {</w:t>
+      </w:r>
+      <w:r>
+        <w:rPr>
+          <w:rFonts w:ascii="Consolas" w:hAnsi="Consolas" w:eastAsia="Consolas"/>
+          <w:sz w:val="17"/>
+        </w:rPr>
+        <w:br w:type="textWrapping"/>
+      </w:r>
+      <w:r>
+        <w:rPr>
+          <w:rFonts w:ascii="Consolas" w:hAnsi="Consolas" w:eastAsia="Consolas"/>
+          <w:sz w:val="17"/>
+        </w:rPr>
+        <w:t xml:space="preserve">        int currentProgress = msg.arg1;</w:t>
+      </w:r>
+      <w:r>
+        <w:rPr>
+          <w:rFonts w:ascii="Consolas" w:hAnsi="Consolas" w:eastAsia="Consolas"/>
+          <w:sz w:val="17"/>
+        </w:rPr>
+        <w:br w:type="textWrapping"/>
+      </w:r>
+      <w:r>
+        <w:rPr>
+          <w:rFonts w:ascii="Consolas" w:hAnsi="Consolas" w:eastAsia="Consolas"/>
+          <w:sz w:val="17"/>
+        </w:rPr>
+        <w:t xml:space="preserve">        if (currentProgress &lt;= 100) {</w:t>
+      </w:r>
+      <w:r>
+        <w:rPr>
+          <w:rFonts w:ascii="Consolas" w:hAnsi="Consolas" w:eastAsia="Consolas"/>
+          <w:sz w:val="17"/>
+        </w:rPr>
+        <w:br w:type="textWrapping"/>
+      </w:r>
+      <w:r>
+        <w:rPr>
+          <w:rFonts w:ascii="Consolas" w:hAnsi="Consolas" w:eastAsia="Consolas"/>
+          <w:sz w:val="17"/>
+        </w:rPr>
+        <w:t xml:space="preserve">            progressbar.setProgress(currentProgress);</w:t>
+      </w:r>
+      <w:r>
+        <w:rPr>
+          <w:rFonts w:ascii="Consolas" w:hAnsi="Consolas" w:eastAsia="Consolas"/>
+          <w:sz w:val="17"/>
+        </w:rPr>
+        <w:br w:type="textWrapping"/>
+      </w:r>
+      <w:r>
+        <w:rPr>
+          <w:rFonts w:ascii="Consolas" w:hAnsi="Consolas" w:eastAsia="Consolas"/>
+          <w:sz w:val="17"/>
+        </w:rPr>
+        <w:t xml:space="preserve">            updateBarHandler.postDelayed(updateThread, 1000);</w:t>
+      </w:r>
+      <w:r>
+        <w:rPr>
+          <w:rFonts w:ascii="Consolas" w:hAnsi="Consolas" w:eastAsia="Consolas"/>
+          <w:sz w:val="17"/>
+        </w:rPr>
+        <w:br w:type="textWrapping"/>
+      </w:r>
+      <w:r>
+        <w:rPr>
+          <w:rFonts w:ascii="Consolas" w:hAnsi="Consolas" w:eastAsia="Consolas"/>
+          <w:sz w:val="17"/>
+        </w:rPr>
+        <w:t xml:space="preserve">        } else {</w:t>
+      </w:r>
+      <w:r>
+        <w:rPr>
+          <w:rFonts w:ascii="Consolas" w:hAnsi="Consolas" w:eastAsia="Consolas"/>
+          <w:sz w:val="17"/>
+        </w:rPr>
+        <w:br w:type="textWrapping"/>
+      </w:r>
+      <w:r>
+        <w:rPr>
+          <w:rFonts w:ascii="Consolas" w:hAnsi="Consolas" w:eastAsia="Consolas"/>
+          <w:sz w:val="17"/>
+        </w:rPr>
+        <w:t xml:space="preserve">            progressValue = 0;</w:t>
+      </w:r>
+      <w:r>
+        <w:rPr>
+          <w:rFonts w:ascii="Consolas" w:hAnsi="Consolas" w:eastAsia="Consolas"/>
+          <w:sz w:val="17"/>
+        </w:rPr>
+        <w:br w:type="textWrapping"/>
+      </w:r>
+      <w:r>
+        <w:rPr>
+          <w:rFonts w:ascii="Consolas" w:hAnsi="Consolas" w:eastAsia="Consolas"/>
+          <w:sz w:val="17"/>
+        </w:rPr>
+        <w:t xml:space="preserve">            progressbar.setProgress(progressValue);</w:t>
+      </w:r>
+      <w:r>
+        <w:rPr>
+          <w:rFonts w:ascii="Consolas" w:hAnsi="Consolas" w:eastAsia="Consolas"/>
+          <w:sz w:val="17"/>
+        </w:rPr>
+        <w:br w:type="textWrapping"/>
+      </w:r>
+      <w:r>
+        <w:rPr>
+          <w:rFonts w:ascii="Consolas" w:hAnsi="Consolas" w:eastAsia="Consolas"/>
+          <w:sz w:val="17"/>
+        </w:rPr>
+        <w:t xml:space="preserve">            progressbar.setVisibility(View.INVISIBLE);</w:t>
+      </w:r>
+      <w:r>
+        <w:rPr>
+          <w:rFonts w:ascii="Consolas" w:hAnsi="Consolas" w:eastAsia="Consolas"/>
+          <w:sz w:val="17"/>
+        </w:rPr>
+        <w:br w:type="textWrapping"/>
+      </w:r>
+      <w:r>
+        <w:rPr>
+          <w:rFonts w:ascii="Consolas" w:hAnsi="Consolas" w:eastAsia="Consolas"/>
+          <w:sz w:val="17"/>
+        </w:rPr>
+        <w:t xml:space="preserve">            updateBarHandler.removeCallbacks(updateThread);</w:t>
+      </w:r>
+      <w:r>
+        <w:rPr>
+          <w:rFonts w:ascii="Consolas" w:hAnsi="Consolas" w:eastAsia="Consolas"/>
+          <w:sz w:val="17"/>
+        </w:rPr>
+        <w:br w:type="textWrapping"/>
+      </w:r>
+      <w:r>
+        <w:rPr>
+          <w:rFonts w:ascii="Consolas" w:hAnsi="Consolas" w:eastAsia="Consolas"/>
+          <w:sz w:val="17"/>
+        </w:rPr>
+        <w:t xml:space="preserve">            Snackbar.make(floatingactionbutton, "网页已打开！", Snackbar.LENGTH_LONG)</w:t>
+      </w:r>
+      <w:r>
+        <w:rPr>
+          <w:rFonts w:ascii="Consolas" w:hAnsi="Consolas" w:eastAsia="Consolas"/>
+          <w:sz w:val="17"/>
+        </w:rPr>
+        <w:br w:type="textWrapping"/>
+      </w:r>
+      <w:r>
+        <w:rPr>
+          <w:rFonts w:ascii="Consolas" w:hAnsi="Consolas" w:eastAsia="Consolas"/>
+          <w:sz w:val="17"/>
+        </w:rPr>
+        <w:t xml:space="preserve">                    .setAction("确定", view -&gt; Toast.makeText(</w:t>
+      </w:r>
+      <w:r>
+        <w:rPr>
+          <w:rFonts w:ascii="Consolas" w:hAnsi="Consolas" w:eastAsia="Consolas"/>
+          <w:sz w:val="17"/>
+        </w:rPr>
+        <w:br w:type="textWrapping"/>
+      </w:r>
+      <w:r>
+        <w:rPr>
+          <w:rFonts w:ascii="Consolas" w:hAnsi="Consolas" w:eastAsia="Consolas"/>
+          <w:sz w:val="17"/>
+        </w:rPr>
+        <w:t xml:space="preserve">                            MainActivity.this, "网页已打开！", Toast.LENGTH_SHORT).show())</w:t>
+      </w:r>
+      <w:r>
+        <w:rPr>
+          <w:rFonts w:ascii="Consolas" w:hAnsi="Consolas" w:eastAsia="Consolas"/>
+          <w:sz w:val="17"/>
+        </w:rPr>
+        <w:br w:type="textWrapping"/>
+      </w:r>
+      <w:r>
+        <w:rPr>
+          <w:rFonts w:ascii="Consolas" w:hAnsi="Consolas" w:eastAsia="Consolas"/>
+          <w:sz w:val="17"/>
+        </w:rPr>
+        <w:t xml:space="preserve">                    .show();</w:t>
+      </w:r>
+      <w:r>
+        <w:rPr>
+          <w:rFonts w:ascii="Consolas" w:hAnsi="Consolas" w:eastAsia="Consolas"/>
+          <w:sz w:val="17"/>
+        </w:rPr>
+        <w:br w:type="textWrapping"/>
+      </w:r>
+      <w:r>
+        <w:rPr>
+          <w:rFonts w:ascii="Consolas" w:hAnsi="Consolas" w:eastAsia="Consolas"/>
+          <w:sz w:val="17"/>
+        </w:rPr>
+        <w:t xml:space="preserve">        }</w:t>
+      </w:r>
+      <w:r>
+        <w:rPr>
+          <w:rFonts w:ascii="Consolas" w:hAnsi="Consolas" w:eastAsia="Consolas"/>
+          <w:sz w:val="17"/>
+        </w:rPr>
+        <w:br w:type="textWrapping"/>
+      </w:r>
+      <w:r>
+        <w:rPr>
+          <w:rFonts w:ascii="Consolas" w:hAnsi="Consolas" w:eastAsia="Consolas"/>
+          <w:sz w:val="17"/>
+        </w:rPr>
+        <w:t xml:space="preserve">    }</w:t>
+      </w:r>
+      <w:r>
+        <w:rPr>
+          <w:rFonts w:ascii="Consolas" w:hAnsi="Consolas" w:eastAsia="Consolas"/>
+          <w:sz w:val="17"/>
+        </w:rPr>
+        <w:br w:type="textWrapping"/>
+      </w:r>
+      <w:r>
+        <w:rPr>
+          <w:rFonts w:ascii="Consolas" w:hAnsi="Consolas" w:eastAsia="Consolas"/>
+          <w:sz w:val="17"/>
+        </w:rPr>
+        <w:t>};</w:t>
+      </w:r>
+    </w:p>
+    <w:p>
+      <w:r>
+        <w:rPr>
+          <w:rFonts w:ascii="Consolas" w:hAnsi="Consolas" w:eastAsia="Consolas"/>
+          <w:sz w:val="17"/>
+        </w:rPr>
         <w:t>@SuppressLint("SetJavaScriptEnabled")</w:t>
-        <w:br/>
+      </w:r>
+      <w:r>
+        <w:rPr>
+          <w:rFonts w:ascii="Consolas" w:hAnsi="Consolas" w:eastAsia="Consolas"/>
+          <w:sz w:val="17"/>
+        </w:rPr>
+        <w:br w:type="textWrapping"/>
+      </w:r>
+      <w:r>
+        <w:rPr>
+          <w:rFonts w:ascii="Consolas" w:hAnsi="Consolas" w:eastAsia="Consolas"/>
+          <w:sz w:val="17"/>
+        </w:rPr>
         <w:t>public void onViewClicked(View v) {</w:t>
-        <w:br/>
+      </w:r>
+      <w:r>
+        <w:rPr>
+          <w:rFonts w:ascii="Consolas" w:hAnsi="Consolas" w:eastAsia="Consolas"/>
+          <w:sz w:val="17"/>
+        </w:rPr>
+        <w:br w:type="textWrapping"/>
+      </w:r>
+      <w:r>
+        <w:rPr>
+          <w:rFonts w:ascii="Consolas" w:hAnsi="Consolas" w:eastAsia="Consolas"/>
+          <w:sz w:val="17"/>
+        </w:rPr>
         <w:t xml:space="preserve">    progressValue = 0;</w:t>
-        <w:br/>
+      </w:r>
+      <w:r>
+        <w:rPr>
+          <w:rFonts w:ascii="Consolas" w:hAnsi="Consolas" w:eastAsia="Consolas"/>
+          <w:sz w:val="17"/>
+        </w:rPr>
+        <w:br w:type="textWrapping"/>
+      </w:r>
+      <w:r>
+        <w:rPr>
+          <w:rFonts w:ascii="Consolas" w:hAnsi="Consolas" w:eastAsia="Consolas"/>
+          <w:sz w:val="17"/>
+        </w:rPr>
         <w:t xml:space="preserve">    progressbar.setProgress(progressValue);</w:t>
-        <w:br/>
+      </w:r>
+      <w:r>
+        <w:rPr>
+          <w:rFonts w:ascii="Consolas" w:hAnsi="Consolas" w:eastAsia="Consolas"/>
+          <w:sz w:val="17"/>
+        </w:rPr>
+        <w:br w:type="textWrapping"/>
+      </w:r>
+      <w:r>
+        <w:rPr>
+          <w:rFonts w:ascii="Consolas" w:hAnsi="Consolas" w:eastAsia="Consolas"/>
+          <w:sz w:val="17"/>
+        </w:rPr>
         <w:t xml:space="preserve">    progressbar.setVisibility(View.VISIBLE);</w:t>
-        <w:br/>
+      </w:r>
+      <w:r>
+        <w:rPr>
+          <w:rFonts w:ascii="Consolas" w:hAnsi="Consolas" w:eastAsia="Consolas"/>
+          <w:sz w:val="17"/>
+        </w:rPr>
+        <w:br w:type="textWrapping"/>
+      </w:r>
+      <w:r>
+        <w:rPr>
+          <w:rFonts w:ascii="Consolas" w:hAnsi="Consolas" w:eastAsia="Consolas"/>
+          <w:sz w:val="17"/>
+        </w:rPr>
         <w:t xml:space="preserve">    webview.getSettings().setJavaScriptEnabled(true);</w:t>
-        <w:br/>
+      </w:r>
+      <w:r>
+        <w:rPr>
+          <w:rFonts w:ascii="Consolas" w:hAnsi="Consolas" w:eastAsia="Consolas"/>
+          <w:sz w:val="17"/>
+        </w:rPr>
+        <w:br w:type="textWrapping"/>
+      </w:r>
+      <w:r>
+        <w:rPr>
+          <w:rFonts w:ascii="Consolas" w:hAnsi="Consolas" w:eastAsia="Consolas"/>
+          <w:sz w:val="17"/>
+        </w:rPr>
         <w:t xml:space="preserve">    webview.getSettings().setSupportZoom(true);</w:t>
-        <w:br/>
+      </w:r>
+      <w:r>
+        <w:rPr>
+          <w:rFonts w:ascii="Consolas" w:hAnsi="Consolas" w:eastAsia="Consolas"/>
+          <w:sz w:val="17"/>
+        </w:rPr>
+        <w:br w:type="textWrapping"/>
+      </w:r>
+      <w:r>
+        <w:rPr>
+          <w:rFonts w:ascii="Consolas" w:hAnsi="Consolas" w:eastAsia="Consolas"/>
+          <w:sz w:val="17"/>
+        </w:rPr>
         <w:t xml:space="preserve">    webview.getSettings().setBuiltInZoomControls(true);</w:t>
-        <w:br/>
+      </w:r>
+      <w:r>
+        <w:rPr>
+          <w:rFonts w:ascii="Consolas" w:hAnsi="Consolas" w:eastAsia="Consolas"/>
+          <w:sz w:val="17"/>
+        </w:rPr>
+        <w:br w:type="textWrapping"/>
+      </w:r>
+      <w:r>
+        <w:rPr>
+          <w:rFonts w:ascii="Consolas" w:hAnsi="Consolas" w:eastAsia="Consolas"/>
+          <w:sz w:val="17"/>
+        </w:rPr>
         <w:t xml:space="preserve">    webview.setWebViewClient(new WebViewClient());</w:t>
-        <w:br/>
+      </w:r>
+      <w:r>
+        <w:rPr>
+          <w:rFonts w:ascii="Consolas" w:hAnsi="Consolas" w:eastAsia="Consolas"/>
+          <w:sz w:val="17"/>
+        </w:rPr>
+        <w:br w:type="textWrapping"/>
+      </w:r>
+      <w:r>
+        <w:rPr>
+          <w:rFonts w:ascii="Consolas" w:hAnsi="Consolas" w:eastAsia="Consolas"/>
+          <w:sz w:val="17"/>
+        </w:rPr>
         <w:t xml:space="preserve">    webview.loadUrl("https://blog.csdn.net/");</w:t>
-        <w:br/>
+      </w:r>
+      <w:r>
+        <w:rPr>
+          <w:rFonts w:ascii="Consolas" w:hAnsi="Consolas" w:eastAsia="Consolas"/>
+          <w:sz w:val="17"/>
+        </w:rPr>
+        <w:br w:type="textWrapping"/>
+      </w:r>
+      <w:r>
+        <w:rPr>
+          <w:rFonts w:ascii="Consolas" w:hAnsi="Consolas" w:eastAsia="Consolas"/>
+          <w:sz w:val="17"/>
+        </w:rPr>
         <w:t xml:space="preserve">    updateBarHandler.removeCallbacks(updateThread);</w:t>
-        <w:br/>
+      </w:r>
+      <w:r>
+        <w:rPr>
+          <w:rFonts w:ascii="Consolas" w:hAnsi="Consolas" w:eastAsia="Consolas"/>
+          <w:sz w:val="17"/>
+        </w:rPr>
+        <w:br w:type="textWrapping"/>
+      </w:r>
+      <w:r>
+        <w:rPr>
+          <w:rFonts w:ascii="Consolas" w:hAnsi="Consolas" w:eastAsia="Consolas"/>
+          <w:sz w:val="17"/>
+        </w:rPr>
         <w:t xml:space="preserve">    updateBarHandler.post(updateThread);</w:t>
-        <w:br/>
+      </w:r>
+      <w:r>
+        <w:rPr>
+          <w:rFonts w:ascii="Consolas" w:hAnsi="Consolas" w:eastAsia="Consolas"/>
+          <w:sz w:val="17"/>
+        </w:rPr>
+        <w:br w:type="textWrapping"/>
+      </w:r>
+      <w:r>
+        <w:rPr>
+          <w:rFonts w:ascii="Consolas" w:hAnsi="Consolas" w:eastAsia="Consolas"/>
+          <w:sz w:val="17"/>
+        </w:rPr>
         <w:t>}</w:t>
       </w:r>
     </w:p>
@@ -8036,21 +8224,24 @@
       </w:pPr>
       <w:r>
         <w:drawing>
-          <wp:inline xmlns:a="http://schemas.openxmlformats.org/drawingml/2006/main" xmlns:pic="http://schemas.openxmlformats.org/drawingml/2006/picture">
-            <wp:extent cx="3977639" cy="8839198"/>
+          <wp:inline distT="0" distB="0" distL="114300" distR="114300">
+            <wp:extent cx="3977005" cy="8838565"/>
+            <wp:effectExtent l="0" t="0" r="10795" b="635"/>
             <wp:docPr id="132" name="Picture 132"/>
             <wp:cNvGraphicFramePr>
-              <a:graphicFrameLocks noChangeAspect="1"/>
+              <a:graphicFrameLocks xmlns:a="http://schemas.openxmlformats.org/drawingml/2006/main" noChangeAspect="1"/>
             </wp:cNvGraphicFramePr>
-            <a:graphic>
+            <a:graphic xmlns:a="http://schemas.openxmlformats.org/drawingml/2006/main">
               <a:graphicData uri="http://schemas.openxmlformats.org/drawingml/2006/picture">
-                <pic:pic>
+                <pic:pic xmlns:pic="http://schemas.openxmlformats.org/drawingml/2006/picture">
                   <pic:nvPicPr>
-                    <pic:cNvPr id="0" name="实验2_程序初始界面_重截.png"/>
-                    <pic:cNvPicPr/>
+                    <pic:cNvPr id="132" name="Picture 132"/>
+                    <pic:cNvPicPr>
+                      <a:picLocks noChangeAspect="1"/>
+                    </pic:cNvPicPr>
                   </pic:nvPicPr>
                   <pic:blipFill>
-                    <a:blip r:embed="rId20"/>
+                    <a:blip r:embed="rId16"/>
                     <a:stretch>
                       <a:fillRect/>
                     </a:stretch>
@@ -8060,7 +8251,9 @@
                       <a:off x="0" y="0"/>
                       <a:ext cx="3977639" cy="8839198"/>
                     </a:xfrm>
-                    <a:prstGeom prst="rect"/>
+                    <a:prstGeom prst="rect">
+                      <a:avLst/>
+                    </a:prstGeom>
                   </pic:spPr>
                 </pic:pic>
               </a:graphicData>
@@ -8088,21 +8281,24 @@
       </w:pPr>
       <w:r>
         <w:drawing>
-          <wp:inline xmlns:a="http://schemas.openxmlformats.org/drawingml/2006/main" xmlns:pic="http://schemas.openxmlformats.org/drawingml/2006/picture">
-            <wp:extent cx="3977639" cy="8839198"/>
+          <wp:inline distT="0" distB="0" distL="114300" distR="114300">
+            <wp:extent cx="3977005" cy="8838565"/>
+            <wp:effectExtent l="0" t="0" r="10795" b="635"/>
             <wp:docPr id="133" name="Picture 133"/>
             <wp:cNvGraphicFramePr>
-              <a:graphicFrameLocks noChangeAspect="1"/>
+              <a:graphicFrameLocks xmlns:a="http://schemas.openxmlformats.org/drawingml/2006/main" noChangeAspect="1"/>
             </wp:cNvGraphicFramePr>
-            <a:graphic>
+            <a:graphic xmlns:a="http://schemas.openxmlformats.org/drawingml/2006/main">
               <a:graphicData uri="http://schemas.openxmlformats.org/drawingml/2006/picture">
-                <pic:pic>
+                <pic:pic xmlns:pic="http://schemas.openxmlformats.org/drawingml/2006/picture">
                   <pic:nvPicPr>
-                    <pic:cNvPr id="0" name="实验2_点击后显示进度条_重截.png"/>
-                    <pic:cNvPicPr/>
+                    <pic:cNvPr id="133" name="Picture 133"/>
+                    <pic:cNvPicPr>
+                      <a:picLocks noChangeAspect="1"/>
+                    </pic:cNvPicPr>
                   </pic:nvPicPr>
                   <pic:blipFill>
-                    <a:blip r:embed="rId21"/>
+                    <a:blip r:embed="rId17"/>
                     <a:stretch>
                       <a:fillRect/>
                     </a:stretch>
@@ -8112,7 +8308,9 @@
                       <a:off x="0" y="0"/>
                       <a:ext cx="3977639" cy="8839198"/>
                     </a:xfrm>
-                    <a:prstGeom prst="rect"/>
+                    <a:prstGeom prst="rect">
+                      <a:avLst/>
+                    </a:prstGeom>
                   </pic:spPr>
                 </pic:pic>
               </a:graphicData>
@@ -8140,21 +8338,24 @@
       </w:pPr>
       <w:r>
         <w:drawing>
-          <wp:inline xmlns:a="http://schemas.openxmlformats.org/drawingml/2006/main" xmlns:pic="http://schemas.openxmlformats.org/drawingml/2006/picture">
-            <wp:extent cx="3977639" cy="8839198"/>
+          <wp:inline distT="0" distB="0" distL="114300" distR="114300">
+            <wp:extent cx="3977005" cy="8838565"/>
+            <wp:effectExtent l="0" t="0" r="10795" b="635"/>
             <wp:docPr id="134" name="Picture 134"/>
             <wp:cNvGraphicFramePr>
-              <a:graphicFrameLocks noChangeAspect="1"/>
+              <a:graphicFrameLocks xmlns:a="http://schemas.openxmlformats.org/drawingml/2006/main" noChangeAspect="1"/>
             </wp:cNvGraphicFramePr>
-            <a:graphic>
+            <a:graphic xmlns:a="http://schemas.openxmlformats.org/drawingml/2006/main">
               <a:graphicData uri="http://schemas.openxmlformats.org/drawingml/2006/picture">
-                <pic:pic>
+                <pic:pic xmlns:pic="http://schemas.openxmlformats.org/drawingml/2006/picture">
                   <pic:nvPicPr>
-                    <pic:cNvPr id="0" name="实验2_WebView页面加载中_重截.png"/>
-                    <pic:cNvPicPr/>
+                    <pic:cNvPr id="134" name="Picture 134"/>
+                    <pic:cNvPicPr>
+                      <a:picLocks noChangeAspect="1"/>
+                    </pic:cNvPicPr>
                   </pic:nvPicPr>
                   <pic:blipFill>
-                    <a:blip r:embed="rId22"/>
+                    <a:blip r:embed="rId18"/>
                     <a:stretch>
                       <a:fillRect/>
                     </a:stretch>
@@ -8164,7 +8365,9 @@
                       <a:off x="0" y="0"/>
                       <a:ext cx="3977639" cy="8839198"/>
                     </a:xfrm>
-                    <a:prstGeom prst="rect"/>
+                    <a:prstGeom prst="rect">
+                      <a:avLst/>
+                    </a:prstGeom>
                   </pic:spPr>
                 </pic:pic>
               </a:graphicData>
@@ -8192,21 +8395,24 @@
       </w:pPr>
       <w:r>
         <w:drawing>
-          <wp:inline xmlns:a="http://schemas.openxmlformats.org/drawingml/2006/main" xmlns:pic="http://schemas.openxmlformats.org/drawingml/2006/picture">
-            <wp:extent cx="3977639" cy="8839198"/>
+          <wp:inline distT="0" distB="0" distL="114300" distR="114300">
+            <wp:extent cx="3977005" cy="8838565"/>
+            <wp:effectExtent l="0" t="0" r="10795" b="635"/>
             <wp:docPr id="135" name="Picture 135"/>
             <wp:cNvGraphicFramePr>
-              <a:graphicFrameLocks noChangeAspect="1"/>
+              <a:graphicFrameLocks xmlns:a="http://schemas.openxmlformats.org/drawingml/2006/main" noChangeAspect="1"/>
             </wp:cNvGraphicFramePr>
-            <a:graphic>
+            <a:graphic xmlns:a="http://schemas.openxmlformats.org/drawingml/2006/main">
               <a:graphicData uri="http://schemas.openxmlformats.org/drawingml/2006/picture">
-                <pic:pic>
+                <pic:pic xmlns:pic="http://schemas.openxmlformats.org/drawingml/2006/picture">
                   <pic:nvPicPr>
-                    <pic:cNvPr id="0" name="实验2_Snackbar完成提示_重截.png"/>
-                    <pic:cNvPicPr/>
+                    <pic:cNvPr id="135" name="Picture 135"/>
+                    <pic:cNvPicPr>
+                      <a:picLocks noChangeAspect="1"/>
+                    </pic:cNvPicPr>
                   </pic:nvPicPr>
                   <pic:blipFill>
-                    <a:blip r:embed="rId23"/>
+                    <a:blip r:embed="rId19"/>
                     <a:stretch>
                       <a:fillRect/>
                     </a:stretch>
@@ -8216,7 +8422,9 @@
                       <a:off x="0" y="0"/>
                       <a:ext cx="3977639" cy="8839198"/>
                     </a:xfrm>
-                    <a:prstGeom prst="rect"/>
+                    <a:prstGeom prst="rect">
+                      <a:avLst/>
+                    </a:prstGeom>
                   </pic:spPr>
                 </pic:pic>
               </a:graphicData>
@@ -8439,7 +8647,7 @@
     <w:sdtPr>
       <w:id w:val="-1"/>
       <w:docPartObj>
-        <w:docPartGallery w:val="AutoText"/>
+        <w:docPartGallery w:val="autotext"/>
       </w:docPartObj>
     </w:sdtPr>
     <w:sdtContent>
@@ -11241,17 +11449,16 @@
 <s:customData xmlns="http://www.wps.cn/officeDocument/2013/wpsCustomData" xmlns:s="http://www.wps.cn/officeDocument/2013/wpsCustomData">
   <customSectProps>
     <customSectPr/>
-    <customSectPr/>
   </customSectProps>
   <customShpExts>
+    <customShpInfo spid="_x0000_s2050"/>
     <customShpInfo spid="_x0000_s1026" textRotate="1"/>
-    <customShpInfo spid="_x0000_s2050"/>
   </customShpExts>
 </s:customData>
 </file>
 
 <file path=customXml/item2.xml><?xml version="1.0" encoding="utf-8"?>
-<b:Sources xmlns:b="http://schemas.openxmlformats.org/officeDocument/2006/bibliography" xmlns="http://schemas.openxmlformats.org/officeDocument/2006/bibliography" SelectedStyle="\APASixthEditionOfficeOnline.xsl" Version="6" StyleName="APA"/>
+<b:Sources xmlns:b="http://schemas.openxmlformats.org/officeDocument/2006/bibliography" xmlns="http://schemas.openxmlformats.org/officeDocument/2006/bibliography" StyleName="APA" Version="6" SelectedStyle="\APASixthEditionOfficeOnline.xsl"/>
 </file>
 
 <file path=customXml/itemProps1.xml><?xml version="1.0" encoding="utf-8"?>

</xml_diff>